<commit_message>
docs: actualizar Omar — 2.43.docx
</commit_message>
<xml_diff>
--- a/Omar — 2.43.docx
+++ b/Omar — 2.43.docx
@@ -2,7 +2,7 @@
 <file path=word/document.xml><?xml version="1.0" encoding="utf-8"?>
 <w:document xmlns:w="http://schemas.openxmlformats.org/wordprocessingml/2006/main" xmlns:m="http://schemas.openxmlformats.org/officeDocument/2006/math" xmlns:r="http://schemas.openxmlformats.org/officeDocument/2006/relationships" xmlns:o="urn:schemas-microsoft-com:office:office" xmlns:v="urn:schemas-microsoft-com:vml" xmlns:w10="urn:schemas-microsoft-com:office:word" xmlns:a="http://schemas.openxmlformats.org/drawingml/2006/main" xmlns:pic="http://schemas.openxmlformats.org/drawingml/2006/picture" xmlns:wp="http://schemas.openxmlformats.org/drawingml/2006/wordprocessingDrawing">
   <w:body>
-    <w:bookmarkStart w:id="22" w:name="omar-2.43"/>
+    <w:bookmarkStart w:id="23" w:name="omar-2.43"/>
     <w:p>
       <w:pPr>
         <w:pStyle w:val="Heading1"/>
@@ -470,8 +470,219 @@
         <w:t xml:space="preserve">Sostengo esa línea como algo que ya es verdad para mí. No la discuto ni la justifico: la mantengo con claridad y dejo que gane peso delante de todos.</w:t>
       </w:r>
     </w:p>
+    <w:p>
+      <w:r>
+        <w:pict>
+          <v:rect style="width:0;height:1.5pt" o:hralign="center" o:hrstd="t" o:hr="t"/>
+        </w:pict>
+      </w:r>
+    </w:p>
     <w:bookmarkEnd w:id="21"/>
+    <w:bookmarkStart w:id="22" w:name="secuencia-de-guión"/>
+    <w:p>
+      <w:pPr>
+        <w:pStyle w:val="Heading2"/>
+      </w:pPr>
+      <w:r>
+        <w:t xml:space="preserve">Secuencia de guión</w:t>
+      </w:r>
+    </w:p>
+    <w:p>
+      <w:pPr>
+        <w:pStyle w:val="FirstParagraph"/>
+      </w:pPr>
+      <w:r>
+        <w:rPr>
+          <w:b/>
+          <w:bCs/>
+        </w:rPr>
+        <w:t xml:space="preserve">INT. CAUTIVERIO 2. TIENDA DE MOKTHAR - TARDE 2.43</w:t>
+      </w:r>
+    </w:p>
+    <w:p>
+      <w:pPr>
+        <w:pStyle w:val="BodyText"/>
+      </w:pPr>
+      <w:r>
+        <w:t xml:space="preserve">En la tienda de Mokthar se tiene una reunión entre algunos representantes de Al Qaeda, el mismo Mokthar y Omar. Hablan tomando el te. Les pillamos a conversación empezada.</w:t>
+      </w:r>
+    </w:p>
+    <w:p>
+      <w:pPr>
+        <w:pStyle w:val="BodyText"/>
+      </w:pPr>
+      <w:r>
+        <w:rPr>
+          <w:b/>
+          <w:bCs/>
+        </w:rPr>
+        <w:t xml:space="preserve">MOKTHAR</w:t>
+      </w:r>
+      <w:r>
+        <w:t xml:space="preserve"> </w:t>
+      </w:r>
+      <w:r>
+        <w:t xml:space="preserve">Vamos obtener más de lo esperado. Más dinero y la liberación de los presos de Burkina y de Mali. Será una victoria para Al Qaeda.</w:t>
+      </w:r>
+    </w:p>
+    <w:p>
+      <w:pPr>
+        <w:pStyle w:val="BodyText"/>
+      </w:pPr>
+      <w:r>
+        <w:rPr>
+          <w:b/>
+          <w:bCs/>
+        </w:rPr>
+        <w:t xml:space="preserve">LÍDER AL QAEDA</w:t>
+      </w:r>
+      <w:r>
+        <w:t xml:space="preserve"> </w:t>
+      </w:r>
+      <w:r>
+        <w:t xml:space="preserve">El Mokthar que conocía yo, decía que hay victoria sólo con la destrucción completa del enemigo… pero nuestro enemigo no ha aceptado todas las condiciones.</w:t>
+      </w:r>
+    </w:p>
+    <w:p>
+      <w:pPr>
+        <w:pStyle w:val="BodyText"/>
+      </w:pPr>
+      <w:r>
+        <w:rPr>
+          <w:b/>
+          <w:bCs/>
+        </w:rPr>
+        <w:t xml:space="preserve">MOKTHAR</w:t>
+      </w:r>
+      <w:r>
+        <w:t xml:space="preserve"> </w:t>
+      </w:r>
+      <w:r>
+        <w:t xml:space="preserve">España no va a poder liberar a los presos de Mauritania. Les habéis pedido algo imposible.</w:t>
+      </w:r>
+    </w:p>
+    <w:p>
+      <w:pPr>
+        <w:pStyle w:val="BodyText"/>
+      </w:pPr>
+      <w:r>
+        <w:t xml:space="preserve">La conversación se mantiene con tono muy calmado, pero se respira tensión. Al líder de Al Qaeda no le hace demasiada gracia la respuesta de Mokthar.</w:t>
+      </w:r>
+    </w:p>
+    <w:p>
+      <w:pPr>
+        <w:pStyle w:val="BodyText"/>
+      </w:pPr>
+      <w:r>
+        <w:rPr>
+          <w:b/>
+          <w:bCs/>
+        </w:rPr>
+        <w:t xml:space="preserve">LÍDER AL QAEDA</w:t>
+      </w:r>
+      <w:r>
+        <w:t xml:space="preserve"> </w:t>
+      </w:r>
+      <w:r>
+        <w:t xml:space="preserve">Tal vez la cosa está en que no les has presionado lo suficiente. No te olvides que tú tienes los rehenes y recibirás el dinero porque nosotros te hemos elegido. Y el Mokthar que yo conocía ya le habría enviado la cabeza de un rehén… para que entiendan que no tienen elección.</w:t>
+      </w:r>
+    </w:p>
+    <w:p>
+      <w:pPr>
+        <w:pStyle w:val="BodyText"/>
+      </w:pPr>
+      <w:r>
+        <w:rPr>
+          <w:b/>
+          <w:bCs/>
+        </w:rPr>
+        <w:t xml:space="preserve">OMAR</w:t>
+      </w:r>
+      <w:r>
+        <w:t xml:space="preserve"> </w:t>
+      </w:r>
+      <w:r>
+        <w:t xml:space="preserve">(interviene, mirando a Mokthar)</w:t>
+      </w:r>
+      <w:r>
+        <w:t xml:space="preserve"> </w:t>
+      </w:r>
+      <w:r>
+        <w:t xml:space="preserve">Y si siguen sin entenderlo… recibirán la cabeza de los otros dos.</w:t>
+      </w:r>
+    </w:p>
+    <w:p>
+      <w:pPr>
+        <w:pStyle w:val="BodyText"/>
+      </w:pPr>
+      <w:r>
+        <w:rPr>
+          <w:b/>
+          <w:bCs/>
+        </w:rPr>
+        <w:t xml:space="preserve">LÍDER AL QAEDA</w:t>
+      </w:r>
+      <w:r>
+        <w:t xml:space="preserve"> </w:t>
+      </w:r>
+      <w:r>
+        <w:t xml:space="preserve">(felicitando a Omar)</w:t>
+      </w:r>
+      <w:r>
+        <w:t xml:space="preserve"> </w:t>
+      </w:r>
+      <w:r>
+        <w:t xml:space="preserve">Así se habla, sobrino.</w:t>
+      </w:r>
+    </w:p>
+    <w:p>
+      <w:pPr>
+        <w:pStyle w:val="BodyText"/>
+      </w:pPr>
+      <w:r>
+        <w:t xml:space="preserve">(a Mokthar, serio)</w:t>
+      </w:r>
+      <w:r>
+        <w:t xml:space="preserve"> </w:t>
+      </w:r>
+      <w:r>
+        <w:t xml:space="preserve">Queremos la liberación de todos los presos. De todos.</w:t>
+      </w:r>
+    </w:p>
+    <w:p>
+      <w:pPr>
+        <w:pStyle w:val="BodyText"/>
+      </w:pPr>
+      <w:r>
+        <w:rPr>
+          <w:b/>
+          <w:bCs/>
+        </w:rPr>
+        <w:t xml:space="preserve">LÍDER AL QAEDA (CONT’D)</w:t>
+      </w:r>
+      <w:r>
+        <w:t xml:space="preserve"> </w:t>
+      </w:r>
+      <w:r>
+        <w:t xml:space="preserve">(ref. a Omar)</w:t>
+      </w:r>
+      <w:r>
+        <w:t xml:space="preserve"> </w:t>
+      </w:r>
+      <w:r>
+        <w:t xml:space="preserve">Y si el Mokthar que yo conocía no es el de ahora… quizá necesitemos a otro hermano al mando.</w:t>
+      </w:r>
+    </w:p>
+    <w:p>
+      <w:pPr>
+        <w:pStyle w:val="BodyText"/>
+      </w:pPr>
+      <w:r>
+        <w:t xml:space="preserve">Mokthar no replica, tomando su te. Omar, por el contrario, está feliz. Sale muy reforzado de esta reunión.</w:t>
+      </w:r>
+    </w:p>
     <w:bookmarkEnd w:id="22"/>
+    <w:bookmarkEnd w:id="23"/>
     <w:sectPr>
       <w:footnotePr>
         <w:numRestart w:val="eachSect"/>

</xml_diff>